<commit_message>
Mise à jour de la couverture
</commit_message>
<xml_diff>
--- a/couverture/couverture.docx
+++ b/couverture/couverture.docx
@@ -326,7 +326,7 @@
         <w:pStyle w:val="Pagedegarde"/>
       </w:pPr>
       <w:r>
-        <w:t>(COMPLETER par Prénom NOM)</w:t>
+        <w:t>Fayçal KHETIM</w:t>
       </w:r>
     </w:p>
     <w:p>
@@ -418,14 +418,19 @@
     </w:p>
     <w:p>
       <w:pPr>
-        <w:pStyle w:val="Pagedegarde"/>
+        <w:spacing w:after="0" w:line="259" w:lineRule="auto"/>
+        <w:ind w:left="70"/>
+        <w:jc w:val="center"/>
+      </w:pPr>
+      <w:r>
         <w:rPr>
           <w:b/>
           <w:bCs/>
           <w:sz w:val="32"/>
           <w:szCs w:val="32"/>
         </w:rPr>
-      </w:pPr>
+        <w:t>É</w:t>
+      </w:r>
       <w:r>
         <w:rPr>
           <w:b/>
@@ -433,25 +438,7 @@
           <w:sz w:val="32"/>
           <w:szCs w:val="32"/>
         </w:rPr>
-        <w:t>(</w:t>
-      </w:r>
-      <w:r>
-        <w:rPr>
-          <w:b/>
-          <w:bCs/>
-          <w:sz w:val="32"/>
-          <w:szCs w:val="32"/>
-        </w:rPr>
-        <w:t>COMPLETER</w:t>
-      </w:r>
-      <w:r>
-        <w:rPr>
-          <w:b/>
-          <w:bCs/>
-          <w:sz w:val="32"/>
-          <w:szCs w:val="32"/>
-        </w:rPr>
-        <w:t>)</w:t>
+        <w:t>tude épidémiologique et génomique des bactéries résistantes aux antibiotiques en filière porcine à l'île de La Réunion.</w:t>
       </w:r>
     </w:p>
     <w:p>
@@ -470,23 +457,7 @@
           <w:sz w:val="24"/>
           <w:szCs w:val="24"/>
         </w:rPr>
-        <w:t>Tuteur</w:t>
-      </w:r>
-      <w:r>
-        <w:rPr>
-          <w:bCs/>
-          <w:sz w:val="24"/>
-          <w:szCs w:val="24"/>
-        </w:rPr>
-        <w:t>/Tutrice</w:t>
-      </w:r>
-      <w:r>
-        <w:rPr>
-          <w:bCs/>
-          <w:sz w:val="24"/>
-          <w:szCs w:val="24"/>
-        </w:rPr>
-        <w:t> </w:t>
+        <w:t>Tuteur </w:t>
       </w:r>
       <w:commentRangeEnd w:id="1"/>
       <w:r>
@@ -513,14 +484,30 @@
         </w:rPr>
         <w:t xml:space="preserve"> </w:t>
       </w:r>
-      <w:commentRangeStart w:id="2"/>
-      <w:r>
+      <w:r>
+        <w:rPr>
+          <w:sz w:val="22"/>
+        </w:rPr>
+        <w:t>Dr David A Wilkinson</w:t>
+      </w:r>
+    </w:p>
+    <w:p>
+      <w:pPr>
+        <w:pStyle w:val="Pagedegarde"/>
         <w:rPr>
           <w:bCs/>
           <w:sz w:val="24"/>
           <w:szCs w:val="24"/>
         </w:rPr>
-        <w:t xml:space="preserve">Titre </w:t>
+      </w:pPr>
+      <w:commentRangeStart w:id="2"/>
+      <w:r>
+        <w:rPr>
+          <w:bCs/>
+          <w:sz w:val="24"/>
+          <w:szCs w:val="24"/>
+        </w:rPr>
+        <w:t>Tuteur </w:t>
       </w:r>
       <w:commentRangeEnd w:id="2"/>
       <w:r>
@@ -538,7 +525,32 @@
           <w:sz w:val="24"/>
           <w:szCs w:val="24"/>
         </w:rPr>
-        <w:t>Prénom NOM</w:t>
+        <w:t>:</w:t>
+      </w:r>
+      <w:r>
+        <w:rPr>
+          <w:sz w:val="24"/>
+          <w:szCs w:val="24"/>
+        </w:rPr>
+        <w:t xml:space="preserve"> </w:t>
+      </w:r>
+      <w:r>
+        <w:rPr>
+          <w:sz w:val="22"/>
+        </w:rPr>
+        <w:t xml:space="preserve">Dr </w:t>
+      </w:r>
+      <w:r>
+        <w:rPr>
+          <w:sz w:val="22"/>
+        </w:rPr>
+        <w:t>Maleck Vasseur</w:t>
+      </w:r>
+      <w:r>
+        <w:rPr>
+          <w:sz w:val="22"/>
+        </w:rPr>
+        <w:t xml:space="preserve">  </w:t>
       </w:r>
     </w:p>
     <w:p>
@@ -918,7 +930,7 @@
         <w:annotationRef/>
       </w:r>
       <w:r>
-        <w:t>Pr (pour professeur), Dr (pour docteur)…</w:t>
+        <w:t>Supprimer la version inutile</w:t>
       </w:r>
     </w:p>
   </w:comment>
@@ -962,8 +974,8 @@
 
 <file path=word/commentsExtended.xml><?xml version="1.0" encoding="utf-8"?>
 <w15:commentsEx xmlns:wpc="http://schemas.microsoft.com/office/word/2010/wordprocessingCanvas" xmlns:cx="http://schemas.microsoft.com/office/drawing/2014/chartex" xmlns:cx1="http://schemas.microsoft.com/office/drawing/2015/9/8/chartex" xmlns:cx2="http://schemas.microsoft.com/office/drawing/2015/10/21/chartex" xmlns:cx3="http://schemas.microsoft.com/office/drawing/2016/5/9/chartex" xmlns:cx4="http://schemas.microsoft.com/office/drawing/2016/5/10/chartex" xmlns:cx5="http://schemas.microsoft.com/office/drawing/2016/5/11/chartex" xmlns:cx6="http://schemas.microsoft.com/office/drawing/2016/5/12/chartex" xmlns:cx7="http://schemas.microsoft.com/office/drawing/2016/5/13/chartex" xmlns:cx8="http://schemas.microsoft.com/office/drawing/2016/5/14/chartex" xmlns:mc="http://schemas.openxmlformats.org/markup-compatibility/2006" xmlns:aink="http://schemas.microsoft.com/office/drawing/2016/ink" xmlns:am3d="http://schemas.microsoft.com/office/drawing/2017/model3d" xmlns:o="urn:schemas-microsoft-com:office:office" xmlns:oel="http://schemas.microsoft.com/office/2019/extlst" xmlns:r="http://schemas.openxmlformats.org/officeDocument/2006/relationships" xmlns:m="http://schemas.openxmlformats.org/officeDocument/2006/math" xmlns:v="urn:schemas-microsoft-com:vml" xmlns:wp14="http://schemas.microsoft.com/office/word/2010/wordprocessingDrawing" xmlns:wp="http://schemas.openxmlformats.org/drawingml/2006/wordprocessingDrawing" xmlns:w10="urn:schemas-microsoft-com:office:word" xmlns:w="http://schemas.openxmlformats.org/wordprocessingml/2006/main" xmlns:w14="http://schemas.microsoft.com/office/word/2010/wordml" xmlns:w15="http://schemas.microsoft.com/office/word/2012/wordml" xmlns:w16cex="http://schemas.microsoft.com/office/word/2018/wordml/cex" xmlns:w16cid="http://schemas.microsoft.com/office/word/2016/wordml/cid" xmlns:w16="http://schemas.microsoft.com/office/word/2018/wordml" xmlns:w16du="http://schemas.microsoft.com/office/word/2023/wordml/word16du" xmlns:w16sdtdh="http://schemas.microsoft.com/office/word/2020/wordml/sdtdatahash" xmlns:w16sdtfl="http://schemas.microsoft.com/office/word/2024/wordml/sdtformatlock" xmlns:w16se="http://schemas.microsoft.com/office/word/2015/wordml/symex" xmlns:wpg="http://schemas.microsoft.com/office/word/2010/wordprocessingGroup" xmlns:wpi="http://schemas.microsoft.com/office/word/2010/wordprocessingInk" xmlns:wne="http://schemas.microsoft.com/office/word/2006/wordml" xmlns:wps="http://schemas.microsoft.com/office/word/2010/wordprocessingShape" mc:Ignorable="w14 w15 w16se w16cid w16 w16cex w16sdtdh w16sdtfl w16du wp14">
-  <w15:commentEx w15:paraId="43132DFE" w15:done="0"/>
-  <w15:commentEx w15:paraId="51D835A0" w15:done="0"/>
+  <w15:commentEx w15:paraId="4D509530" w15:done="1"/>
+  <w15:commentEx w15:paraId="277820D0" w15:done="1"/>
   <w15:commentEx w15:paraId="6E8E187C" w15:done="0"/>
   <w15:commentEx w15:paraId="5C4E3353" w15:done="0"/>
 </w15:commentsEx>
@@ -971,8 +983,8 @@
 
 <file path=word/commentsIds.xml><?xml version="1.0" encoding="utf-8"?>
 <w16cid:commentsIds xmlns:wpc="http://schemas.microsoft.com/office/word/2010/wordprocessingCanvas" xmlns:cx="http://schemas.microsoft.com/office/drawing/2014/chartex" xmlns:cx1="http://schemas.microsoft.com/office/drawing/2015/9/8/chartex" xmlns:cx2="http://schemas.microsoft.com/office/drawing/2015/10/21/chartex" xmlns:cx3="http://schemas.microsoft.com/office/drawing/2016/5/9/chartex" xmlns:cx4="http://schemas.microsoft.com/office/drawing/2016/5/10/chartex" xmlns:cx5="http://schemas.microsoft.com/office/drawing/2016/5/11/chartex" xmlns:cx6="http://schemas.microsoft.com/office/drawing/2016/5/12/chartex" xmlns:cx7="http://schemas.microsoft.com/office/drawing/2016/5/13/chartex" xmlns:cx8="http://schemas.microsoft.com/office/drawing/2016/5/14/chartex" xmlns:mc="http://schemas.openxmlformats.org/markup-compatibility/2006" xmlns:aink="http://schemas.microsoft.com/office/drawing/2016/ink" xmlns:am3d="http://schemas.microsoft.com/office/drawing/2017/model3d" xmlns:o="urn:schemas-microsoft-com:office:office" xmlns:oel="http://schemas.microsoft.com/office/2019/extlst" xmlns:r="http://schemas.openxmlformats.org/officeDocument/2006/relationships" xmlns:m="http://schemas.openxmlformats.org/officeDocument/2006/math" xmlns:v="urn:schemas-microsoft-com:vml" xmlns:wp14="http://schemas.microsoft.com/office/word/2010/wordprocessingDrawing" xmlns:wp="http://schemas.openxmlformats.org/drawingml/2006/wordprocessingDrawing" xmlns:w10="urn:schemas-microsoft-com:office:word" xmlns:w="http://schemas.openxmlformats.org/wordprocessingml/2006/main" xmlns:w14="http://schemas.microsoft.com/office/word/2010/wordml" xmlns:w15="http://schemas.microsoft.com/office/word/2012/wordml" xmlns:w16cex="http://schemas.microsoft.com/office/word/2018/wordml/cex" xmlns:w16cid="http://schemas.microsoft.com/office/word/2016/wordml/cid" xmlns:w16="http://schemas.microsoft.com/office/word/2018/wordml" xmlns:w16du="http://schemas.microsoft.com/office/word/2023/wordml/word16du" xmlns:w16sdtdh="http://schemas.microsoft.com/office/word/2020/wordml/sdtdatahash" xmlns:w16sdtfl="http://schemas.microsoft.com/office/word/2024/wordml/sdtformatlock" xmlns:w16se="http://schemas.microsoft.com/office/word/2015/wordml/symex" xmlns:wpg="http://schemas.microsoft.com/office/word/2010/wordprocessingGroup" xmlns:wpi="http://schemas.microsoft.com/office/word/2010/wordprocessingInk" xmlns:wne="http://schemas.microsoft.com/office/word/2006/wordml" xmlns:wps="http://schemas.microsoft.com/office/word/2010/wordprocessingShape" mc:Ignorable="w14 w15 w16se w16cid w16 w16cex w16sdtdh w16sdtfl w16du wp14">
-  <w16cid:commentId w16cid:paraId="43132DFE" w16cid:durableId="233FC016"/>
-  <w16cid:commentId w16cid:paraId="51D835A0" w16cid:durableId="233FC017"/>
+  <w16cid:commentId w16cid:paraId="4D509530" w16cid:durableId="233FC016"/>
+  <w16cid:commentId w16cid:paraId="277820D0" w16cid:durableId="59D00106"/>
   <w16cid:commentId w16cid:paraId="6E8E187C" w16cid:durableId="233FC018"/>
   <w16cid:commentId w16cid:paraId="5C4E3353" w16cid:durableId="233FC019"/>
 </w16cid:commentsIds>

</xml_diff>

<commit_message>
Mise à jour mémoire
</commit_message>
<xml_diff>
--- a/couverture/couverture.docx
+++ b/couverture/couverture.docx
@@ -1,6 +1,6 @@
 
 <file path=word/document.xml><?xml version="1.0" encoding="utf-8"?>
-<w:document xmlns:wpc="http://schemas.microsoft.com/office/word/2010/wordprocessingCanvas" xmlns:cx="http://schemas.microsoft.com/office/drawing/2014/chartex" xmlns:cx1="http://schemas.microsoft.com/office/drawing/2015/9/8/chartex" xmlns:cx2="http://schemas.microsoft.com/office/drawing/2015/10/21/chartex" xmlns:cx3="http://schemas.microsoft.com/office/drawing/2016/5/9/chartex" xmlns:cx4="http://schemas.microsoft.com/office/drawing/2016/5/10/chartex" xmlns:cx5="http://schemas.microsoft.com/office/drawing/2016/5/11/chartex" xmlns:cx6="http://schemas.microsoft.com/office/drawing/2016/5/12/chartex" xmlns:cx7="http://schemas.microsoft.com/office/drawing/2016/5/13/chartex" xmlns:cx8="http://schemas.microsoft.com/office/drawing/2016/5/14/chartex" xmlns:mc="http://schemas.openxmlformats.org/markup-compatibility/2006" xmlns:aink="http://schemas.microsoft.com/office/drawing/2016/ink" xmlns:am3d="http://schemas.microsoft.com/office/drawing/2017/model3d" xmlns:o="urn:schemas-microsoft-com:office:office" xmlns:oel="http://schemas.microsoft.com/office/2019/extlst" xmlns:r="http://schemas.openxmlformats.org/officeDocument/2006/relationships" xmlns:m="http://schemas.openxmlformats.org/officeDocument/2006/math" xmlns:v="urn:schemas-microsoft-com:vml" xmlns:wp14="http://schemas.microsoft.com/office/word/2010/wordprocessingDrawing" xmlns:wp="http://schemas.openxmlformats.org/drawingml/2006/wordprocessingDrawing" xmlns:w10="urn:schemas-microsoft-com:office:word" xmlns:w="http://schemas.openxmlformats.org/wordprocessingml/2006/main" xmlns:w14="http://schemas.microsoft.com/office/word/2010/wordml" xmlns:w15="http://schemas.microsoft.com/office/word/2012/wordml" xmlns:w16cex="http://schemas.microsoft.com/office/word/2018/wordml/cex" xmlns:w16cid="http://schemas.microsoft.com/office/word/2016/wordml/cid" xmlns:w16="http://schemas.microsoft.com/office/word/2018/wordml" xmlns:w16du="http://schemas.microsoft.com/office/word/2023/wordml/word16du" xmlns:w16sdtdh="http://schemas.microsoft.com/office/word/2020/wordml/sdtdatahash" xmlns:w16sdtfl="http://schemas.microsoft.com/office/word/2024/wordml/sdtformatlock" xmlns:w16se="http://schemas.microsoft.com/office/word/2015/wordml/symex" xmlns:wpg="http://schemas.microsoft.com/office/word/2010/wordprocessingGroup" xmlns:wpi="http://schemas.microsoft.com/office/word/2010/wordprocessingInk" xmlns:wne="http://schemas.microsoft.com/office/word/2006/wordml" xmlns:wps="http://schemas.microsoft.com/office/word/2010/wordprocessingShape" mc:Ignorable="w14 w15 w16se w16cid w16 w16cex w16sdtdh w16sdtfl w16du wp14">
+<w:document xmlns:wpc="http://schemas.microsoft.com/office/word/2010/wordprocessingCanvas" xmlns:cx="http://schemas.microsoft.com/office/drawing/2014/chartex" xmlns:cx1="http://schemas.microsoft.com/office/drawing/2015/9/8/chartex" xmlns:cx2="http://schemas.microsoft.com/office/drawing/2015/10/21/chartex" xmlns:cx3="http://schemas.microsoft.com/office/drawing/2016/5/9/chartex" xmlns:cx4="http://schemas.microsoft.com/office/drawing/2016/5/10/chartex" xmlns:cx5="http://schemas.microsoft.com/office/drawing/2016/5/11/chartex" xmlns:cx6="http://schemas.microsoft.com/office/drawing/2016/5/12/chartex" xmlns:cx7="http://schemas.microsoft.com/office/drawing/2016/5/13/chartex" xmlns:cx8="http://schemas.microsoft.com/office/drawing/2016/5/14/chartex" xmlns:mc="http://schemas.openxmlformats.org/markup-compatibility/2006" xmlns:m="http://schemas.openxmlformats.org/officeDocument/2006/math" xmlns:aink="http://schemas.microsoft.com/office/drawing/2016/ink" xmlns:am3d="http://schemas.microsoft.com/office/drawing/2017/model3d" xmlns:oel="http://schemas.microsoft.com/office/2019/extlst" xmlns:r="http://schemas.openxmlformats.org/officeDocument/2006/relationships" xmlns:wp14="http://schemas.microsoft.com/office/word/2010/wordprocessingDrawing" xmlns:wp="http://schemas.openxmlformats.org/drawingml/2006/wordprocessingDrawing" xmlns:wpg="http://schemas.microsoft.com/office/word/2010/wordprocessingGroup" xmlns:wpi="http://schemas.microsoft.com/office/word/2010/wordprocessingInk" xmlns:wps="http://schemas.microsoft.com/office/word/2010/wordprocessingShape" xmlns:o="urn:schemas-microsoft-com:office:office" xmlns:v="urn:schemas-microsoft-com:vml" xmlns:w10="urn:schemas-microsoft-com:office:word" xmlns:w="http://schemas.openxmlformats.org/wordprocessingml/2006/main" xmlns:w14="http://schemas.microsoft.com/office/word/2010/wordml" xmlns:w15="http://schemas.microsoft.com/office/word/2012/wordml" xmlns:w16cei="http://schemas.microsoft.com/office/word/2026/wordml/cei" xmlns:w16cex="http://schemas.microsoft.com/office/word/2018/wordml/cex" xmlns:w16cid="http://schemas.microsoft.com/office/word/2016/wordml/cid" xmlns:w16="http://schemas.microsoft.com/office/word/2018/wordml" xmlns:w16sdtdh="http://schemas.microsoft.com/office/word/2020/wordml/sdtdatahash" xmlns:w16sdtfl="http://schemas.microsoft.com/office/word/2024/wordml/sdtformatlock" xmlns:w16se="http://schemas.microsoft.com/office/word/2015/wordml/symex" xmlns:w16du="http://schemas.microsoft.com/office/word/2023/wordml/word16du" xmlns:wne="http://schemas.microsoft.com/office/word/2006/wordml" mc:Ignorable="w14 w15 w16se w16cid w16 w16cex w16sdtdh w16sdtfl w16du wp14">
   <w:body>
     <w:p>
       <w:bookmarkStart w:id="0" w:name="_Ref474990207"/>
@@ -9,18 +9,18 @@
           <w:noProof/>
         </w:rPr>
         <w:drawing>
-          <wp:anchor distT="0" distB="0" distL="114300" distR="114300" simplePos="0" relativeHeight="251659264" behindDoc="0" locked="0" layoutInCell="1" allowOverlap="1" wp14:anchorId="70E7803C" wp14:editId="0D051076">
+          <wp:anchor distT="0" distB="0" distL="114300" distR="114300" simplePos="0" relativeHeight="251661312" behindDoc="0" locked="0" layoutInCell="0" allowOverlap="1" wp14:anchorId="4DF96961" wp14:editId="744C7AD0">
             <wp:simplePos x="0" y="0"/>
             <wp:positionH relativeFrom="column">
-              <wp:posOffset>-60960</wp:posOffset>
+              <wp:posOffset>4015438</wp:posOffset>
             </wp:positionH>
-            <wp:positionV relativeFrom="paragraph">
-              <wp:posOffset>4445</wp:posOffset>
+            <wp:positionV relativeFrom="page">
+              <wp:posOffset>838835</wp:posOffset>
             </wp:positionV>
-            <wp:extent cx="1672590" cy="408305"/>
-            <wp:effectExtent l="0" t="0" r="3810" b="0"/>
-            <wp:wrapTopAndBottom/>
-            <wp:docPr id="3" name="Image 7"/>
+            <wp:extent cx="1881265" cy="648079"/>
+            <wp:effectExtent l="0" t="0" r="0" b="0"/>
+            <wp:wrapNone/>
+            <wp:docPr id="1817184181" name="Image 2" descr="Une image contenant texte, Police, logo, Graphique&#10;&#10;Le contenu généré par l’IA peut être incorrect."/>
             <wp:cNvGraphicFramePr>
               <a:graphicFrameLocks xmlns:a="http://schemas.openxmlformats.org/drawingml/2006/main" noChangeAspect="1"/>
             </wp:cNvGraphicFramePr>
@@ -28,9 +28,9 @@
               <a:graphicData uri="http://schemas.openxmlformats.org/drawingml/2006/picture">
                 <pic:pic xmlns:pic="http://schemas.openxmlformats.org/drawingml/2006/picture">
                   <pic:nvPicPr>
-                    <pic:cNvPr id="3" name="Image 7"/>
+                    <pic:cNvPr id="1817184181" name="Image 2" descr="Une image contenant texte, Police, logo, Graphique&#10;&#10;Le contenu généré par l’IA peut être incorrect."/>
                     <pic:cNvPicPr>
-                      <a:picLocks noChangeAspect="1" noChangeArrowheads="1"/>
+                      <a:picLocks noChangeAspect="1"/>
                     </pic:cNvPicPr>
                   </pic:nvPicPr>
                   <pic:blipFill>
@@ -45,26 +45,22 @@
                       <a:fillRect/>
                     </a:stretch>
                   </pic:blipFill>
-                  <pic:spPr bwMode="auto">
+                  <pic:spPr>
                     <a:xfrm>
                       <a:off x="0" y="0"/>
-                      <a:ext cx="1672590" cy="408305"/>
+                      <a:ext cx="1881265" cy="648079"/>
                     </a:xfrm>
                     <a:prstGeom prst="rect">
                       <a:avLst/>
                     </a:prstGeom>
-                    <a:noFill/>
-                    <a:ln>
-                      <a:noFill/>
-                    </a:ln>
                   </pic:spPr>
                 </pic:pic>
               </a:graphicData>
             </a:graphic>
-            <wp14:sizeRelH relativeFrom="page">
+            <wp14:sizeRelH relativeFrom="margin">
               <wp14:pctWidth>0</wp14:pctWidth>
             </wp14:sizeRelH>
-            <wp14:sizeRelV relativeFrom="page">
+            <wp14:sizeRelV relativeFrom="margin">
               <wp14:pctHeight>0</wp14:pctHeight>
             </wp14:sizeRelV>
           </wp:anchor>
@@ -74,181 +70,19 @@
         <w:rPr>
           <w:noProof/>
         </w:rPr>
-        <mc:AlternateContent>
-          <mc:Choice Requires="wps">
-            <w:drawing>
-              <wp:anchor distT="0" distB="0" distL="114300" distR="114300" simplePos="0" relativeHeight="251654144" behindDoc="0" locked="0" layoutInCell="1" allowOverlap="1" wp14:anchorId="337D3951" wp14:editId="660CAFCA">
-                <wp:simplePos x="0" y="0"/>
-                <wp:positionH relativeFrom="column">
-                  <wp:posOffset>4419336</wp:posOffset>
-                </wp:positionH>
-                <wp:positionV relativeFrom="paragraph">
-                  <wp:posOffset>-99946</wp:posOffset>
-                </wp:positionV>
-                <wp:extent cx="1437005" cy="743585"/>
-                <wp:effectExtent l="0" t="0" r="0" b="0"/>
-                <wp:wrapNone/>
-                <wp:docPr id="2" name="Rectangle 6"/>
-                <wp:cNvGraphicFramePr>
-                  <a:graphicFrameLocks xmlns:a="http://schemas.openxmlformats.org/drawingml/2006/main"/>
-                </wp:cNvGraphicFramePr>
-                <a:graphic xmlns:a="http://schemas.openxmlformats.org/drawingml/2006/main">
-                  <a:graphicData uri="http://schemas.microsoft.com/office/word/2010/wordprocessingShape">
-                    <wps:wsp>
-                      <wps:cNvSpPr>
-                        <a:spLocks noChangeArrowheads="1"/>
-                      </wps:cNvSpPr>
-                      <wps:spPr bwMode="auto">
-                        <a:xfrm>
-                          <a:off x="0" y="0"/>
-                          <a:ext cx="1437005" cy="743585"/>
-                        </a:xfrm>
-                        <a:prstGeom prst="rect">
-                          <a:avLst/>
-                        </a:prstGeom>
-                        <a:solidFill>
-                          <a:srgbClr val="FFFFFF"/>
-                        </a:solidFill>
-                        <a:ln>
-                          <a:noFill/>
-                        </a:ln>
-                        <a:extLst>
-                          <a:ext uri="{91240B29-F687-4F45-9708-019B960494DF}">
-                            <a14:hiddenLine xmlns:a14="http://schemas.microsoft.com/office/drawing/2010/main" w="9525">
-                              <a:solidFill>
-                                <a:srgbClr val="000000"/>
-                              </a:solidFill>
-                              <a:miter lim="800000"/>
-                              <a:headEnd/>
-                              <a:tailEnd/>
-                            </a14:hiddenLine>
-                          </a:ext>
-                        </a:extLst>
-                      </wps:spPr>
-                      <wps:txbx>
-                        <w:txbxContent>
-                          <w:p>
-                            <w:pPr>
-                              <w:jc w:val="center"/>
-                              <w:rPr>
-                                <w:rFonts w:ascii="Tahoma" w:hAnsi="Tahoma" w:cs="Tahoma"/>
-                              </w:rPr>
-                            </w:pPr>
-                            <w:r>
-                              <w:rPr>
-                                <w:rFonts w:ascii="Tahoma" w:hAnsi="Tahoma" w:cs="Tahoma"/>
-                              </w:rPr>
-                              <w:t>Logo</w:t>
-                            </w:r>
-                            <w:r>
-                              <w:rPr>
-                                <w:rFonts w:ascii="Tahoma" w:hAnsi="Tahoma" w:cs="Tahoma"/>
-                              </w:rPr>
-                              <w:t>(s)</w:t>
-                            </w:r>
-                            <w:r>
-                              <w:rPr>
-                                <w:rFonts w:ascii="Tahoma" w:hAnsi="Tahoma" w:cs="Tahoma"/>
-                              </w:rPr>
-                              <w:t xml:space="preserve"> organisme</w:t>
-                            </w:r>
-                            <w:r>
-                              <w:rPr>
-                                <w:rFonts w:ascii="Tahoma" w:hAnsi="Tahoma" w:cs="Tahoma"/>
-                              </w:rPr>
-                              <w:t>(s)</w:t>
-                            </w:r>
-                            <w:r>
-                              <w:rPr>
-                                <w:rFonts w:ascii="Tahoma" w:hAnsi="Tahoma" w:cs="Tahoma"/>
-                              </w:rPr>
-                              <w:t xml:space="preserve"> d’accueil</w:t>
-                            </w:r>
-                          </w:p>
-                        </w:txbxContent>
-                      </wps:txbx>
-                      <wps:bodyPr rot="0" vert="horz" wrap="square" lIns="91440" tIns="45720" rIns="91440" bIns="45720" anchor="t" anchorCtr="0" upright="1">
-                        <a:noAutofit/>
-                      </wps:bodyPr>
-                    </wps:wsp>
-                  </a:graphicData>
-                </a:graphic>
-                <wp14:sizeRelH relativeFrom="page">
-                  <wp14:pctWidth>0</wp14:pctWidth>
-                </wp14:sizeRelH>
-                <wp14:sizeRelV relativeFrom="page">
-                  <wp14:pctHeight>0</wp14:pctHeight>
-                </wp14:sizeRelV>
-              </wp:anchor>
-            </w:drawing>
-          </mc:Choice>
-          <mc:Fallback>
-            <w:pict>
-              <v:rect w14:anchorId="337D3951" id="Rectangle 6" o:spid="_x0000_s1026" style="position:absolute;left:0;text-align:left;margin-left:348pt;margin-top:-7.85pt;width:113.15pt;height:58.55pt;z-index:251654144;visibility:visible;mso-wrap-style:square;mso-width-percent:0;mso-height-percent:0;mso-wrap-distance-left:9pt;mso-wrap-distance-top:0;mso-wrap-distance-right:9pt;mso-wrap-distance-bottom:0;mso-position-horizontal:absolute;mso-position-horizontal-relative:text;mso-position-vertical:absolute;mso-position-vertical-relative:text;mso-width-percent:0;mso-height-percent:0;mso-width-relative:page;mso-height-relative:page;v-text-anchor:top" o:gfxdata="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" stroked="f">
-                <v:textbox>
-                  <w:txbxContent>
-                    <w:p>
-                      <w:pPr>
-                        <w:jc w:val="center"/>
-                        <w:rPr>
-                          <w:rFonts w:ascii="Tahoma" w:hAnsi="Tahoma" w:cs="Tahoma"/>
-                        </w:rPr>
-                      </w:pPr>
-                      <w:r>
-                        <w:rPr>
-                          <w:rFonts w:ascii="Tahoma" w:hAnsi="Tahoma" w:cs="Tahoma"/>
-                        </w:rPr>
-                        <w:t>Logo</w:t>
-                      </w:r>
-                      <w:r>
-                        <w:rPr>
-                          <w:rFonts w:ascii="Tahoma" w:hAnsi="Tahoma" w:cs="Tahoma"/>
-                        </w:rPr>
-                        <w:t>(s)</w:t>
-                      </w:r>
-                      <w:r>
-                        <w:rPr>
-                          <w:rFonts w:ascii="Tahoma" w:hAnsi="Tahoma" w:cs="Tahoma"/>
-                        </w:rPr>
-                        <w:t xml:space="preserve"> organisme</w:t>
-                      </w:r>
-                      <w:r>
-                        <w:rPr>
-                          <w:rFonts w:ascii="Tahoma" w:hAnsi="Tahoma" w:cs="Tahoma"/>
-                        </w:rPr>
-                        <w:t>(s)</w:t>
-                      </w:r>
-                      <w:r>
-                        <w:rPr>
-                          <w:rFonts w:ascii="Tahoma" w:hAnsi="Tahoma" w:cs="Tahoma"/>
-                        </w:rPr>
-                        <w:t xml:space="preserve"> d’accueil</w:t>
-                      </w:r>
-                    </w:p>
-                  </w:txbxContent>
-                </v:textbox>
-              </v:rect>
-            </w:pict>
-          </mc:Fallback>
-        </mc:AlternateContent>
-      </w:r>
-      <w:r>
-        <w:rPr>
-          <w:noProof/>
-        </w:rPr>
         <w:drawing>
-          <wp:anchor distT="0" distB="0" distL="114300" distR="114300" simplePos="0" relativeHeight="251666432" behindDoc="0" locked="0" layoutInCell="0" allowOverlap="1" wp14:anchorId="0FC0D0A5" wp14:editId="7009C7E4">
+          <wp:anchor distT="0" distB="0" distL="114300" distR="114300" simplePos="0" relativeHeight="251660288" behindDoc="0" locked="0" layoutInCell="0" allowOverlap="1" wp14:anchorId="35106FD4" wp14:editId="31EFBF78">
             <wp:simplePos x="0" y="0"/>
             <wp:positionH relativeFrom="column">
-              <wp:posOffset>2240507</wp:posOffset>
+              <wp:posOffset>1925486</wp:posOffset>
             </wp:positionH>
             <wp:positionV relativeFrom="page">
-              <wp:posOffset>866955</wp:posOffset>
+              <wp:posOffset>866775</wp:posOffset>
             </wp:positionV>
             <wp:extent cx="1606550" cy="503555"/>
             <wp:effectExtent l="0" t="0" r="0" b="0"/>
             <wp:wrapNone/>
-            <wp:docPr id="1" name="Image 2"/>
+            <wp:docPr id="1" name="Image 2" descr="Une image contenant texte, Police, logo, Graphique&#10;&#10;Le contenu généré par l’IA peut être incorrect."/>
             <wp:cNvGraphicFramePr>
               <a:graphicFrameLocks xmlns:a="http://schemas.openxmlformats.org/drawingml/2006/main" noChangeAspect="1"/>
             </wp:cNvGraphicFramePr>
@@ -256,7 +90,7 @@
               <a:graphicData uri="http://schemas.openxmlformats.org/drawingml/2006/picture">
                 <pic:pic xmlns:pic="http://schemas.openxmlformats.org/drawingml/2006/picture">
                   <pic:nvPicPr>
-                    <pic:cNvPr id="3" name="Image 2"/>
+                    <pic:cNvPr id="1" name="Image 2" descr="Une image contenant texte, Police, logo, Graphique&#10;&#10;Le contenu généré par l’IA peut être incorrect."/>
                     <pic:cNvPicPr>
                       <a:picLocks noChangeAspect="1"/>
                     </pic:cNvPicPr>
@@ -294,6 +128,72 @@
           </wp:anchor>
         </w:drawing>
       </w:r>
+      <w:r>
+        <w:rPr>
+          <w:noProof/>
+        </w:rPr>
+        <w:drawing>
+          <wp:anchor distT="0" distB="0" distL="114300" distR="114300" simplePos="0" relativeHeight="251659264" behindDoc="0" locked="0" layoutInCell="1" allowOverlap="1" wp14:anchorId="36B6EFF9" wp14:editId="2320F49B">
+            <wp:simplePos x="0" y="0"/>
+            <wp:positionH relativeFrom="column">
+              <wp:posOffset>-450704</wp:posOffset>
+            </wp:positionH>
+            <wp:positionV relativeFrom="paragraph">
+              <wp:posOffset>4445</wp:posOffset>
+            </wp:positionV>
+            <wp:extent cx="1672590" cy="408305"/>
+            <wp:effectExtent l="0" t="0" r="3810" b="0"/>
+            <wp:wrapTopAndBottom/>
+            <wp:docPr id="3" name="Image 7" descr="Une image contenant Police, texte, Graphique, graphisme&#10;&#10;Le contenu généré par l’IA peut être incorrect."/>
+            <wp:cNvGraphicFramePr>
+              <a:graphicFrameLocks xmlns:a="http://schemas.openxmlformats.org/drawingml/2006/main" noChangeAspect="1"/>
+            </wp:cNvGraphicFramePr>
+            <a:graphic xmlns:a="http://schemas.openxmlformats.org/drawingml/2006/main">
+              <a:graphicData uri="http://schemas.openxmlformats.org/drawingml/2006/picture">
+                <pic:pic xmlns:pic="http://schemas.openxmlformats.org/drawingml/2006/picture">
+                  <pic:nvPicPr>
+                    <pic:cNvPr id="3" name="Image 7" descr="Une image contenant Police, texte, Graphique, graphisme&#10;&#10;Le contenu généré par l’IA peut être incorrect."/>
+                    <pic:cNvPicPr>
+                      <a:picLocks noChangeAspect="1" noChangeArrowheads="1"/>
+                    </pic:cNvPicPr>
+                  </pic:nvPicPr>
+                  <pic:blipFill>
+                    <a:blip r:embed="rId10" cstate="print">
+                      <a:extLst>
+                        <a:ext uri="{28A0092B-C50C-407E-A947-70E740481C1C}">
+                          <a14:useLocalDpi xmlns:a14="http://schemas.microsoft.com/office/drawing/2010/main" val="0"/>
+                        </a:ext>
+                      </a:extLst>
+                    </a:blip>
+                    <a:stretch>
+                      <a:fillRect/>
+                    </a:stretch>
+                  </pic:blipFill>
+                  <pic:spPr bwMode="auto">
+                    <a:xfrm>
+                      <a:off x="0" y="0"/>
+                      <a:ext cx="1672590" cy="408305"/>
+                    </a:xfrm>
+                    <a:prstGeom prst="rect">
+                      <a:avLst/>
+                    </a:prstGeom>
+                    <a:noFill/>
+                    <a:ln>
+                      <a:noFill/>
+                    </a:ln>
+                  </pic:spPr>
+                </pic:pic>
+              </a:graphicData>
+            </a:graphic>
+            <wp14:sizeRelH relativeFrom="page">
+              <wp14:pctWidth>0</wp14:pctWidth>
+            </wp14:sizeRelH>
+            <wp14:sizeRelV relativeFrom="page">
+              <wp14:pctHeight>0</wp14:pctHeight>
+            </wp14:sizeRelV>
+          </wp:anchor>
+        </w:drawing>
+      </w:r>
     </w:p>
     <w:p/>
     <w:p>
@@ -566,13 +466,22 @@
         <w:t xml:space="preserve">soutenu publiquement le </w:t>
       </w:r>
       <w:r>
-        <w:t>XX xxxx 20</w:t>
+        <w:t>07</w:t>
+      </w:r>
+      <w:r>
+        <w:t xml:space="preserve"> </w:t>
+      </w:r>
+      <w:r>
+        <w:t>septembre</w:t>
+      </w:r>
+      <w:r>
+        <w:t xml:space="preserve"> 20</w:t>
       </w:r>
       <w:r>
         <w:t>2</w:t>
       </w:r>
       <w:r>
-        <w:t>x</w:t>
+        <w:t>6</w:t>
       </w:r>
     </w:p>
     <w:p>
@@ -887,8 +796,8 @@
       </w:pPr>
     </w:p>
     <w:sectPr>
-      <w:headerReference w:type="even" r:id="rId13"/>
-      <w:headerReference w:type="default" r:id="rId14"/>
+      <w:headerReference w:type="even" r:id="rId14"/>
+      <w:headerReference w:type="default" r:id="rId15"/>
       <w:type w:val="oddPage"/>
       <w:pgSz w:w="11906" w:h="16838" w:code="9"/>
       <w:pgMar w:top="1418" w:right="1418" w:bottom="1418" w:left="1418" w:header="720" w:footer="720" w:gutter="709"/>
@@ -901,7 +810,7 @@
 </file>
 
 <file path=word/comments.xml><?xml version="1.0" encoding="utf-8"?>
-<w:comments xmlns:wpc="http://schemas.microsoft.com/office/word/2010/wordprocessingCanvas" xmlns:cx="http://schemas.microsoft.com/office/drawing/2014/chartex" xmlns:cx1="http://schemas.microsoft.com/office/drawing/2015/9/8/chartex" xmlns:cx2="http://schemas.microsoft.com/office/drawing/2015/10/21/chartex" xmlns:cx3="http://schemas.microsoft.com/office/drawing/2016/5/9/chartex" xmlns:cx4="http://schemas.microsoft.com/office/drawing/2016/5/10/chartex" xmlns:cx5="http://schemas.microsoft.com/office/drawing/2016/5/11/chartex" xmlns:cx6="http://schemas.microsoft.com/office/drawing/2016/5/12/chartex" xmlns:cx7="http://schemas.microsoft.com/office/drawing/2016/5/13/chartex" xmlns:cx8="http://schemas.microsoft.com/office/drawing/2016/5/14/chartex" xmlns:mc="http://schemas.openxmlformats.org/markup-compatibility/2006" xmlns:aink="http://schemas.microsoft.com/office/drawing/2016/ink" xmlns:am3d="http://schemas.microsoft.com/office/drawing/2017/model3d" xmlns:o="urn:schemas-microsoft-com:office:office" xmlns:oel="http://schemas.microsoft.com/office/2019/extlst" xmlns:r="http://schemas.openxmlformats.org/officeDocument/2006/relationships" xmlns:m="http://schemas.openxmlformats.org/officeDocument/2006/math" xmlns:v="urn:schemas-microsoft-com:vml" xmlns:wp14="http://schemas.microsoft.com/office/word/2010/wordprocessingDrawing" xmlns:wp="http://schemas.openxmlformats.org/drawingml/2006/wordprocessingDrawing" xmlns:w10="urn:schemas-microsoft-com:office:word" xmlns:w="http://schemas.openxmlformats.org/wordprocessingml/2006/main" xmlns:w14="http://schemas.microsoft.com/office/word/2010/wordml" xmlns:w15="http://schemas.microsoft.com/office/word/2012/wordml" xmlns:w16cex="http://schemas.microsoft.com/office/word/2018/wordml/cex" xmlns:w16cid="http://schemas.microsoft.com/office/word/2016/wordml/cid" xmlns:w16="http://schemas.microsoft.com/office/word/2018/wordml" xmlns:w16du="http://schemas.microsoft.com/office/word/2023/wordml/word16du" xmlns:w16sdtdh="http://schemas.microsoft.com/office/word/2020/wordml/sdtdatahash" xmlns:w16sdtfl="http://schemas.microsoft.com/office/word/2024/wordml/sdtformatlock" xmlns:w16se="http://schemas.microsoft.com/office/word/2015/wordml/symex" xmlns:wpg="http://schemas.microsoft.com/office/word/2010/wordprocessingGroup" xmlns:wpi="http://schemas.microsoft.com/office/word/2010/wordprocessingInk" xmlns:wne="http://schemas.microsoft.com/office/word/2006/wordml" xmlns:wps="http://schemas.microsoft.com/office/word/2010/wordprocessingShape" mc:Ignorable="w14 w15 w16se w16cid w16 w16cex w16sdtdh w16sdtfl w16du wp14">
+<w:comments xmlns:wpc="http://schemas.microsoft.com/office/word/2010/wordprocessingCanvas" xmlns:cx="http://schemas.microsoft.com/office/drawing/2014/chartex" xmlns:cx1="http://schemas.microsoft.com/office/drawing/2015/9/8/chartex" xmlns:cx2="http://schemas.microsoft.com/office/drawing/2015/10/21/chartex" xmlns:cx3="http://schemas.microsoft.com/office/drawing/2016/5/9/chartex" xmlns:cx4="http://schemas.microsoft.com/office/drawing/2016/5/10/chartex" xmlns:cx5="http://schemas.microsoft.com/office/drawing/2016/5/11/chartex" xmlns:cx6="http://schemas.microsoft.com/office/drawing/2016/5/12/chartex" xmlns:cx7="http://schemas.microsoft.com/office/drawing/2016/5/13/chartex" xmlns:cx8="http://schemas.microsoft.com/office/drawing/2016/5/14/chartex" xmlns:mc="http://schemas.openxmlformats.org/markup-compatibility/2006" xmlns:m="http://schemas.openxmlformats.org/officeDocument/2006/math" xmlns:aink="http://schemas.microsoft.com/office/drawing/2016/ink" xmlns:am3d="http://schemas.microsoft.com/office/drawing/2017/model3d" xmlns:oel="http://schemas.microsoft.com/office/2019/extlst" xmlns:r="http://schemas.openxmlformats.org/officeDocument/2006/relationships" xmlns:wp14="http://schemas.microsoft.com/office/word/2010/wordprocessingDrawing" xmlns:wp="http://schemas.openxmlformats.org/drawingml/2006/wordprocessingDrawing" xmlns:wpg="http://schemas.microsoft.com/office/word/2010/wordprocessingGroup" xmlns:wpi="http://schemas.microsoft.com/office/word/2010/wordprocessingInk" xmlns:wps="http://schemas.microsoft.com/office/word/2010/wordprocessingShape" xmlns:o="urn:schemas-microsoft-com:office:office" xmlns:v="urn:schemas-microsoft-com:vml" xmlns:w10="urn:schemas-microsoft-com:office:word" xmlns:w="http://schemas.openxmlformats.org/wordprocessingml/2006/main" xmlns:w14="http://schemas.microsoft.com/office/word/2010/wordml" xmlns:w15="http://schemas.microsoft.com/office/word/2012/wordml" xmlns:w16cei="http://schemas.microsoft.com/office/word/2026/wordml/cei" xmlns:w16cex="http://schemas.microsoft.com/office/word/2018/wordml/cex" xmlns:w16cid="http://schemas.microsoft.com/office/word/2016/wordml/cid" xmlns:w16="http://schemas.microsoft.com/office/word/2018/wordml" xmlns:w16sdtdh="http://schemas.microsoft.com/office/word/2020/wordml/sdtdatahash" xmlns:w16sdtfl="http://schemas.microsoft.com/office/word/2024/wordml/sdtformatlock" xmlns:w16se="http://schemas.microsoft.com/office/word/2015/wordml/symex" xmlns:w16du="http://schemas.microsoft.com/office/word/2023/wordml/word16du" xmlns:wne="http://schemas.microsoft.com/office/word/2006/wordml" mc:Ignorable="w14 w15 w16se w16cid w16 w16cex w16sdtdh w16sdtfl w16du wp14">
   <w:comment w:id="1" w:author="Auteur" w:initials="A">
     <w:p>
       <w:pPr>
@@ -973,7 +882,7 @@
 </file>
 
 <file path=word/commentsExtended.xml><?xml version="1.0" encoding="utf-8"?>
-<w15:commentsEx xmlns:wpc="http://schemas.microsoft.com/office/word/2010/wordprocessingCanvas" xmlns:cx="http://schemas.microsoft.com/office/drawing/2014/chartex" xmlns:cx1="http://schemas.microsoft.com/office/drawing/2015/9/8/chartex" xmlns:cx2="http://schemas.microsoft.com/office/drawing/2015/10/21/chartex" xmlns:cx3="http://schemas.microsoft.com/office/drawing/2016/5/9/chartex" xmlns:cx4="http://schemas.microsoft.com/office/drawing/2016/5/10/chartex" xmlns:cx5="http://schemas.microsoft.com/office/drawing/2016/5/11/chartex" xmlns:cx6="http://schemas.microsoft.com/office/drawing/2016/5/12/chartex" xmlns:cx7="http://schemas.microsoft.com/office/drawing/2016/5/13/chartex" xmlns:cx8="http://schemas.microsoft.com/office/drawing/2016/5/14/chartex" xmlns:mc="http://schemas.openxmlformats.org/markup-compatibility/2006" xmlns:aink="http://schemas.microsoft.com/office/drawing/2016/ink" xmlns:am3d="http://schemas.microsoft.com/office/drawing/2017/model3d" xmlns:o="urn:schemas-microsoft-com:office:office" xmlns:oel="http://schemas.microsoft.com/office/2019/extlst" xmlns:r="http://schemas.openxmlformats.org/officeDocument/2006/relationships" xmlns:m="http://schemas.openxmlformats.org/officeDocument/2006/math" xmlns:v="urn:schemas-microsoft-com:vml" xmlns:wp14="http://schemas.microsoft.com/office/word/2010/wordprocessingDrawing" xmlns:wp="http://schemas.openxmlformats.org/drawingml/2006/wordprocessingDrawing" xmlns:w10="urn:schemas-microsoft-com:office:word" xmlns:w="http://schemas.openxmlformats.org/wordprocessingml/2006/main" xmlns:w14="http://schemas.microsoft.com/office/word/2010/wordml" xmlns:w15="http://schemas.microsoft.com/office/word/2012/wordml" xmlns:w16cex="http://schemas.microsoft.com/office/word/2018/wordml/cex" xmlns:w16cid="http://schemas.microsoft.com/office/word/2016/wordml/cid" xmlns:w16="http://schemas.microsoft.com/office/word/2018/wordml" xmlns:w16du="http://schemas.microsoft.com/office/word/2023/wordml/word16du" xmlns:w16sdtdh="http://schemas.microsoft.com/office/word/2020/wordml/sdtdatahash" xmlns:w16sdtfl="http://schemas.microsoft.com/office/word/2024/wordml/sdtformatlock" xmlns:w16se="http://schemas.microsoft.com/office/word/2015/wordml/symex" xmlns:wpg="http://schemas.microsoft.com/office/word/2010/wordprocessingGroup" xmlns:wpi="http://schemas.microsoft.com/office/word/2010/wordprocessingInk" xmlns:wne="http://schemas.microsoft.com/office/word/2006/wordml" xmlns:wps="http://schemas.microsoft.com/office/word/2010/wordprocessingShape" mc:Ignorable="w14 w15 w16se w16cid w16 w16cex w16sdtdh w16sdtfl w16du wp14">
+<w15:commentsEx xmlns:wpc="http://schemas.microsoft.com/office/word/2010/wordprocessingCanvas" xmlns:cx="http://schemas.microsoft.com/office/drawing/2014/chartex" xmlns:cx1="http://schemas.microsoft.com/office/drawing/2015/9/8/chartex" xmlns:cx2="http://schemas.microsoft.com/office/drawing/2015/10/21/chartex" xmlns:cx3="http://schemas.microsoft.com/office/drawing/2016/5/9/chartex" xmlns:cx4="http://schemas.microsoft.com/office/drawing/2016/5/10/chartex" xmlns:cx5="http://schemas.microsoft.com/office/drawing/2016/5/11/chartex" xmlns:cx6="http://schemas.microsoft.com/office/drawing/2016/5/12/chartex" xmlns:cx7="http://schemas.microsoft.com/office/drawing/2016/5/13/chartex" xmlns:cx8="http://schemas.microsoft.com/office/drawing/2016/5/14/chartex" xmlns:mc="http://schemas.openxmlformats.org/markup-compatibility/2006" xmlns:m="http://schemas.openxmlformats.org/officeDocument/2006/math" xmlns:aink="http://schemas.microsoft.com/office/drawing/2016/ink" xmlns:am3d="http://schemas.microsoft.com/office/drawing/2017/model3d" xmlns:oel="http://schemas.microsoft.com/office/2019/extlst" xmlns:r="http://schemas.openxmlformats.org/officeDocument/2006/relationships" xmlns:wp14="http://schemas.microsoft.com/office/word/2010/wordprocessingDrawing" xmlns:wp="http://schemas.openxmlformats.org/drawingml/2006/wordprocessingDrawing" xmlns:wpg="http://schemas.microsoft.com/office/word/2010/wordprocessingGroup" xmlns:wpi="http://schemas.microsoft.com/office/word/2010/wordprocessingInk" xmlns:wps="http://schemas.microsoft.com/office/word/2010/wordprocessingShape" xmlns:o="urn:schemas-microsoft-com:office:office" xmlns:v="urn:schemas-microsoft-com:vml" xmlns:w10="urn:schemas-microsoft-com:office:word" xmlns:w="http://schemas.openxmlformats.org/wordprocessingml/2006/main" xmlns:w14="http://schemas.microsoft.com/office/word/2010/wordml" xmlns:w15="http://schemas.microsoft.com/office/word/2012/wordml" xmlns:w16cei="http://schemas.microsoft.com/office/word/2026/wordml/cei" xmlns:w16cex="http://schemas.microsoft.com/office/word/2018/wordml/cex" xmlns:w16cid="http://schemas.microsoft.com/office/word/2016/wordml/cid" xmlns:w16="http://schemas.microsoft.com/office/word/2018/wordml" xmlns:w16sdtdh="http://schemas.microsoft.com/office/word/2020/wordml/sdtdatahash" xmlns:w16sdtfl="http://schemas.microsoft.com/office/word/2024/wordml/sdtformatlock" xmlns:w16se="http://schemas.microsoft.com/office/word/2015/wordml/symex" xmlns:w16du="http://schemas.microsoft.com/office/word/2023/wordml/word16du" xmlns:wne="http://schemas.microsoft.com/office/word/2006/wordml" mc:Ignorable="w14 w15 w16se w16cid w16 w16cex w16sdtdh w16sdtfl w16du wp14">
   <w15:commentEx w15:paraId="4D509530" w15:done="1"/>
   <w15:commentEx w15:paraId="277820D0" w15:done="1"/>
   <w15:commentEx w15:paraId="6E8E187C" w15:done="0"/>
@@ -982,7 +891,7 @@
 </file>
 
 <file path=word/commentsIds.xml><?xml version="1.0" encoding="utf-8"?>
-<w16cid:commentsIds xmlns:wpc="http://schemas.microsoft.com/office/word/2010/wordprocessingCanvas" xmlns:cx="http://schemas.microsoft.com/office/drawing/2014/chartex" xmlns:cx1="http://schemas.microsoft.com/office/drawing/2015/9/8/chartex" xmlns:cx2="http://schemas.microsoft.com/office/drawing/2015/10/21/chartex" xmlns:cx3="http://schemas.microsoft.com/office/drawing/2016/5/9/chartex" xmlns:cx4="http://schemas.microsoft.com/office/drawing/2016/5/10/chartex" xmlns:cx5="http://schemas.microsoft.com/office/drawing/2016/5/11/chartex" xmlns:cx6="http://schemas.microsoft.com/office/drawing/2016/5/12/chartex" xmlns:cx7="http://schemas.microsoft.com/office/drawing/2016/5/13/chartex" xmlns:cx8="http://schemas.microsoft.com/office/drawing/2016/5/14/chartex" xmlns:mc="http://schemas.openxmlformats.org/markup-compatibility/2006" xmlns:aink="http://schemas.microsoft.com/office/drawing/2016/ink" xmlns:am3d="http://schemas.microsoft.com/office/drawing/2017/model3d" xmlns:o="urn:schemas-microsoft-com:office:office" xmlns:oel="http://schemas.microsoft.com/office/2019/extlst" xmlns:r="http://schemas.openxmlformats.org/officeDocument/2006/relationships" xmlns:m="http://schemas.openxmlformats.org/officeDocument/2006/math" xmlns:v="urn:schemas-microsoft-com:vml" xmlns:wp14="http://schemas.microsoft.com/office/word/2010/wordprocessingDrawing" xmlns:wp="http://schemas.openxmlformats.org/drawingml/2006/wordprocessingDrawing" xmlns:w10="urn:schemas-microsoft-com:office:word" xmlns:w="http://schemas.openxmlformats.org/wordprocessingml/2006/main" xmlns:w14="http://schemas.microsoft.com/office/word/2010/wordml" xmlns:w15="http://schemas.microsoft.com/office/word/2012/wordml" xmlns:w16cex="http://schemas.microsoft.com/office/word/2018/wordml/cex" xmlns:w16cid="http://schemas.microsoft.com/office/word/2016/wordml/cid" xmlns:w16="http://schemas.microsoft.com/office/word/2018/wordml" xmlns:w16du="http://schemas.microsoft.com/office/word/2023/wordml/word16du" xmlns:w16sdtdh="http://schemas.microsoft.com/office/word/2020/wordml/sdtdatahash" xmlns:w16sdtfl="http://schemas.microsoft.com/office/word/2024/wordml/sdtformatlock" xmlns:w16se="http://schemas.microsoft.com/office/word/2015/wordml/symex" xmlns:wpg="http://schemas.microsoft.com/office/word/2010/wordprocessingGroup" xmlns:wpi="http://schemas.microsoft.com/office/word/2010/wordprocessingInk" xmlns:wne="http://schemas.microsoft.com/office/word/2006/wordml" xmlns:wps="http://schemas.microsoft.com/office/word/2010/wordprocessingShape" mc:Ignorable="w14 w15 w16se w16cid w16 w16cex w16sdtdh w16sdtfl w16du wp14">
+<w16cid:commentsIds xmlns:wpc="http://schemas.microsoft.com/office/word/2010/wordprocessingCanvas" xmlns:cx="http://schemas.microsoft.com/office/drawing/2014/chartex" xmlns:cx1="http://schemas.microsoft.com/office/drawing/2015/9/8/chartex" xmlns:cx2="http://schemas.microsoft.com/office/drawing/2015/10/21/chartex" xmlns:cx3="http://schemas.microsoft.com/office/drawing/2016/5/9/chartex" xmlns:cx4="http://schemas.microsoft.com/office/drawing/2016/5/10/chartex" xmlns:cx5="http://schemas.microsoft.com/office/drawing/2016/5/11/chartex" xmlns:cx6="http://schemas.microsoft.com/office/drawing/2016/5/12/chartex" xmlns:cx7="http://schemas.microsoft.com/office/drawing/2016/5/13/chartex" xmlns:cx8="http://schemas.microsoft.com/office/drawing/2016/5/14/chartex" xmlns:mc="http://schemas.openxmlformats.org/markup-compatibility/2006" xmlns:m="http://schemas.openxmlformats.org/officeDocument/2006/math" xmlns:aink="http://schemas.microsoft.com/office/drawing/2016/ink" xmlns:am3d="http://schemas.microsoft.com/office/drawing/2017/model3d" xmlns:oel="http://schemas.microsoft.com/office/2019/extlst" xmlns:r="http://schemas.openxmlformats.org/officeDocument/2006/relationships" xmlns:wp14="http://schemas.microsoft.com/office/word/2010/wordprocessingDrawing" xmlns:wp="http://schemas.openxmlformats.org/drawingml/2006/wordprocessingDrawing" xmlns:wpg="http://schemas.microsoft.com/office/word/2010/wordprocessingGroup" xmlns:wpi="http://schemas.microsoft.com/office/word/2010/wordprocessingInk" xmlns:wps="http://schemas.microsoft.com/office/word/2010/wordprocessingShape" xmlns:o="urn:schemas-microsoft-com:office:office" xmlns:v="urn:schemas-microsoft-com:vml" xmlns:w10="urn:schemas-microsoft-com:office:word" xmlns:w="http://schemas.openxmlformats.org/wordprocessingml/2006/main" xmlns:w14="http://schemas.microsoft.com/office/word/2010/wordml" xmlns:w15="http://schemas.microsoft.com/office/word/2012/wordml" xmlns:w16cei="http://schemas.microsoft.com/office/word/2026/wordml/cei" xmlns:w16cex="http://schemas.microsoft.com/office/word/2018/wordml/cex" xmlns:w16cid="http://schemas.microsoft.com/office/word/2016/wordml/cid" xmlns:w16="http://schemas.microsoft.com/office/word/2018/wordml" xmlns:w16sdtdh="http://schemas.microsoft.com/office/word/2020/wordml/sdtdatahash" xmlns:w16sdtfl="http://schemas.microsoft.com/office/word/2024/wordml/sdtformatlock" xmlns:w16se="http://schemas.microsoft.com/office/word/2015/wordml/symex" xmlns:w16du="http://schemas.microsoft.com/office/word/2023/wordml/word16du" xmlns:wne="http://schemas.microsoft.com/office/word/2006/wordml" mc:Ignorable="w14 w15 w16se w16cid w16 w16cex w16sdtdh w16sdtfl w16du wp14">
   <w16cid:commentId w16cid:paraId="4D509530" w16cid:durableId="233FC016"/>
   <w16cid:commentId w16cid:paraId="277820D0" w16cid:durableId="59D00106"/>
   <w16cid:commentId w16cid:paraId="6E8E187C" w16cid:durableId="233FC018"/>
@@ -991,7 +900,7 @@
 </file>
 
 <file path=word/endnotes.xml><?xml version="1.0" encoding="utf-8"?>
-<w:endnotes xmlns:wpc="http://schemas.microsoft.com/office/word/2010/wordprocessingCanvas" xmlns:cx="http://schemas.microsoft.com/office/drawing/2014/chartex" xmlns:cx1="http://schemas.microsoft.com/office/drawing/2015/9/8/chartex" xmlns:cx2="http://schemas.microsoft.com/office/drawing/2015/10/21/chartex" xmlns:cx3="http://schemas.microsoft.com/office/drawing/2016/5/9/chartex" xmlns:cx4="http://schemas.microsoft.com/office/drawing/2016/5/10/chartex" xmlns:cx5="http://schemas.microsoft.com/office/drawing/2016/5/11/chartex" xmlns:cx6="http://schemas.microsoft.com/office/drawing/2016/5/12/chartex" xmlns:cx7="http://schemas.microsoft.com/office/drawing/2016/5/13/chartex" xmlns:cx8="http://schemas.microsoft.com/office/drawing/2016/5/14/chartex" xmlns:mc="http://schemas.openxmlformats.org/markup-compatibility/2006" xmlns:aink="http://schemas.microsoft.com/office/drawing/2016/ink" xmlns:am3d="http://schemas.microsoft.com/office/drawing/2017/model3d" xmlns:o="urn:schemas-microsoft-com:office:office" xmlns:oel="http://schemas.microsoft.com/office/2019/extlst" xmlns:r="http://schemas.openxmlformats.org/officeDocument/2006/relationships" xmlns:m="http://schemas.openxmlformats.org/officeDocument/2006/math" xmlns:v="urn:schemas-microsoft-com:vml" xmlns:wp14="http://schemas.microsoft.com/office/word/2010/wordprocessingDrawing" xmlns:wp="http://schemas.openxmlformats.org/drawingml/2006/wordprocessingDrawing" xmlns:w10="urn:schemas-microsoft-com:office:word" xmlns:w="http://schemas.openxmlformats.org/wordprocessingml/2006/main" xmlns:w14="http://schemas.microsoft.com/office/word/2010/wordml" xmlns:w15="http://schemas.microsoft.com/office/word/2012/wordml" xmlns:w16cex="http://schemas.microsoft.com/office/word/2018/wordml/cex" xmlns:w16cid="http://schemas.microsoft.com/office/word/2016/wordml/cid" xmlns:w16="http://schemas.microsoft.com/office/word/2018/wordml" xmlns:w16du="http://schemas.microsoft.com/office/word/2023/wordml/word16du" xmlns:w16sdtdh="http://schemas.microsoft.com/office/word/2020/wordml/sdtdatahash" xmlns:w16sdtfl="http://schemas.microsoft.com/office/word/2024/wordml/sdtformatlock" xmlns:w16se="http://schemas.microsoft.com/office/word/2015/wordml/symex" xmlns:wpg="http://schemas.microsoft.com/office/word/2010/wordprocessingGroup" xmlns:wpi="http://schemas.microsoft.com/office/word/2010/wordprocessingInk" xmlns:wne="http://schemas.microsoft.com/office/word/2006/wordml" xmlns:wps="http://schemas.microsoft.com/office/word/2010/wordprocessingShape" mc:Ignorable="w14 w15 w16se w16cid w16 w16cex w16sdtdh w16sdtfl w16du wp14">
+<w:endnotes xmlns:wpc="http://schemas.microsoft.com/office/word/2010/wordprocessingCanvas" xmlns:cx="http://schemas.microsoft.com/office/drawing/2014/chartex" xmlns:cx1="http://schemas.microsoft.com/office/drawing/2015/9/8/chartex" xmlns:cx2="http://schemas.microsoft.com/office/drawing/2015/10/21/chartex" xmlns:cx3="http://schemas.microsoft.com/office/drawing/2016/5/9/chartex" xmlns:cx4="http://schemas.microsoft.com/office/drawing/2016/5/10/chartex" xmlns:cx5="http://schemas.microsoft.com/office/drawing/2016/5/11/chartex" xmlns:cx6="http://schemas.microsoft.com/office/drawing/2016/5/12/chartex" xmlns:cx7="http://schemas.microsoft.com/office/drawing/2016/5/13/chartex" xmlns:cx8="http://schemas.microsoft.com/office/drawing/2016/5/14/chartex" xmlns:mc="http://schemas.openxmlformats.org/markup-compatibility/2006" xmlns:m="http://schemas.openxmlformats.org/officeDocument/2006/math" xmlns:aink="http://schemas.microsoft.com/office/drawing/2016/ink" xmlns:am3d="http://schemas.microsoft.com/office/drawing/2017/model3d" xmlns:oel="http://schemas.microsoft.com/office/2019/extlst" xmlns:r="http://schemas.openxmlformats.org/officeDocument/2006/relationships" xmlns:wp14="http://schemas.microsoft.com/office/word/2010/wordprocessingDrawing" xmlns:wp="http://schemas.openxmlformats.org/drawingml/2006/wordprocessingDrawing" xmlns:wpg="http://schemas.microsoft.com/office/word/2010/wordprocessingGroup" xmlns:wpi="http://schemas.microsoft.com/office/word/2010/wordprocessingInk" xmlns:wps="http://schemas.microsoft.com/office/word/2010/wordprocessingShape" xmlns:o="urn:schemas-microsoft-com:office:office" xmlns:v="urn:schemas-microsoft-com:vml" xmlns:w10="urn:schemas-microsoft-com:office:word" xmlns:w="http://schemas.openxmlformats.org/wordprocessingml/2006/main" xmlns:w14="http://schemas.microsoft.com/office/word/2010/wordml" xmlns:w15="http://schemas.microsoft.com/office/word/2012/wordml" xmlns:w16cei="http://schemas.microsoft.com/office/word/2026/wordml/cei" xmlns:w16cex="http://schemas.microsoft.com/office/word/2018/wordml/cex" xmlns:w16cid="http://schemas.microsoft.com/office/word/2016/wordml/cid" xmlns:w16="http://schemas.microsoft.com/office/word/2018/wordml" xmlns:w16sdtdh="http://schemas.microsoft.com/office/word/2020/wordml/sdtdatahash" xmlns:w16sdtfl="http://schemas.microsoft.com/office/word/2024/wordml/sdtformatlock" xmlns:w16se="http://schemas.microsoft.com/office/word/2015/wordml/symex" xmlns:w16du="http://schemas.microsoft.com/office/word/2023/wordml/word16du" xmlns:wne="http://schemas.microsoft.com/office/word/2006/wordml" mc:Ignorable="w14 w15 w16se w16cid w16 w16cex w16sdtdh w16sdtfl w16du wp14">
   <w:endnote w:type="separator" w:id="-1">
     <w:p>
       <w:pPr>
@@ -1016,7 +925,7 @@
 </file>
 
 <file path=word/footnotes.xml><?xml version="1.0" encoding="utf-8"?>
-<w:footnotes xmlns:wpc="http://schemas.microsoft.com/office/word/2010/wordprocessingCanvas" xmlns:cx="http://schemas.microsoft.com/office/drawing/2014/chartex" xmlns:cx1="http://schemas.microsoft.com/office/drawing/2015/9/8/chartex" xmlns:cx2="http://schemas.microsoft.com/office/drawing/2015/10/21/chartex" xmlns:cx3="http://schemas.microsoft.com/office/drawing/2016/5/9/chartex" xmlns:cx4="http://schemas.microsoft.com/office/drawing/2016/5/10/chartex" xmlns:cx5="http://schemas.microsoft.com/office/drawing/2016/5/11/chartex" xmlns:cx6="http://schemas.microsoft.com/office/drawing/2016/5/12/chartex" xmlns:cx7="http://schemas.microsoft.com/office/drawing/2016/5/13/chartex" xmlns:cx8="http://schemas.microsoft.com/office/drawing/2016/5/14/chartex" xmlns:mc="http://schemas.openxmlformats.org/markup-compatibility/2006" xmlns:aink="http://schemas.microsoft.com/office/drawing/2016/ink" xmlns:am3d="http://schemas.microsoft.com/office/drawing/2017/model3d" xmlns:o="urn:schemas-microsoft-com:office:office" xmlns:oel="http://schemas.microsoft.com/office/2019/extlst" xmlns:r="http://schemas.openxmlformats.org/officeDocument/2006/relationships" xmlns:m="http://schemas.openxmlformats.org/officeDocument/2006/math" xmlns:v="urn:schemas-microsoft-com:vml" xmlns:wp14="http://schemas.microsoft.com/office/word/2010/wordprocessingDrawing" xmlns:wp="http://schemas.openxmlformats.org/drawingml/2006/wordprocessingDrawing" xmlns:w10="urn:schemas-microsoft-com:office:word" xmlns:w="http://schemas.openxmlformats.org/wordprocessingml/2006/main" xmlns:w14="http://schemas.microsoft.com/office/word/2010/wordml" xmlns:w15="http://schemas.microsoft.com/office/word/2012/wordml" xmlns:w16cex="http://schemas.microsoft.com/office/word/2018/wordml/cex" xmlns:w16cid="http://schemas.microsoft.com/office/word/2016/wordml/cid" xmlns:w16="http://schemas.microsoft.com/office/word/2018/wordml" xmlns:w16du="http://schemas.microsoft.com/office/word/2023/wordml/word16du" xmlns:w16sdtdh="http://schemas.microsoft.com/office/word/2020/wordml/sdtdatahash" xmlns:w16sdtfl="http://schemas.microsoft.com/office/word/2024/wordml/sdtformatlock" xmlns:w16se="http://schemas.microsoft.com/office/word/2015/wordml/symex" xmlns:wpg="http://schemas.microsoft.com/office/word/2010/wordprocessingGroup" xmlns:wpi="http://schemas.microsoft.com/office/word/2010/wordprocessingInk" xmlns:wne="http://schemas.microsoft.com/office/word/2006/wordml" xmlns:wps="http://schemas.microsoft.com/office/word/2010/wordprocessingShape" mc:Ignorable="w14 w15 w16se w16cid w16 w16cex w16sdtdh w16sdtfl w16du wp14">
+<w:footnotes xmlns:wpc="http://schemas.microsoft.com/office/word/2010/wordprocessingCanvas" xmlns:cx="http://schemas.microsoft.com/office/drawing/2014/chartex" xmlns:cx1="http://schemas.microsoft.com/office/drawing/2015/9/8/chartex" xmlns:cx2="http://schemas.microsoft.com/office/drawing/2015/10/21/chartex" xmlns:cx3="http://schemas.microsoft.com/office/drawing/2016/5/9/chartex" xmlns:cx4="http://schemas.microsoft.com/office/drawing/2016/5/10/chartex" xmlns:cx5="http://schemas.microsoft.com/office/drawing/2016/5/11/chartex" xmlns:cx6="http://schemas.microsoft.com/office/drawing/2016/5/12/chartex" xmlns:cx7="http://schemas.microsoft.com/office/drawing/2016/5/13/chartex" xmlns:cx8="http://schemas.microsoft.com/office/drawing/2016/5/14/chartex" xmlns:mc="http://schemas.openxmlformats.org/markup-compatibility/2006" xmlns:m="http://schemas.openxmlformats.org/officeDocument/2006/math" xmlns:aink="http://schemas.microsoft.com/office/drawing/2016/ink" xmlns:am3d="http://schemas.microsoft.com/office/drawing/2017/model3d" xmlns:oel="http://schemas.microsoft.com/office/2019/extlst" xmlns:r="http://schemas.openxmlformats.org/officeDocument/2006/relationships" xmlns:wp14="http://schemas.microsoft.com/office/word/2010/wordprocessingDrawing" xmlns:wp="http://schemas.openxmlformats.org/drawingml/2006/wordprocessingDrawing" xmlns:wpg="http://schemas.microsoft.com/office/word/2010/wordprocessingGroup" xmlns:wpi="http://schemas.microsoft.com/office/word/2010/wordprocessingInk" xmlns:wps="http://schemas.microsoft.com/office/word/2010/wordprocessingShape" xmlns:o="urn:schemas-microsoft-com:office:office" xmlns:v="urn:schemas-microsoft-com:vml" xmlns:w10="urn:schemas-microsoft-com:office:word" xmlns:w="http://schemas.openxmlformats.org/wordprocessingml/2006/main" xmlns:w14="http://schemas.microsoft.com/office/word/2010/wordml" xmlns:w15="http://schemas.microsoft.com/office/word/2012/wordml" xmlns:w16cei="http://schemas.microsoft.com/office/word/2026/wordml/cei" xmlns:w16cex="http://schemas.microsoft.com/office/word/2018/wordml/cex" xmlns:w16cid="http://schemas.microsoft.com/office/word/2016/wordml/cid" xmlns:w16="http://schemas.microsoft.com/office/word/2018/wordml" xmlns:w16sdtdh="http://schemas.microsoft.com/office/word/2020/wordml/sdtdatahash" xmlns:w16sdtfl="http://schemas.microsoft.com/office/word/2024/wordml/sdtformatlock" xmlns:w16se="http://schemas.microsoft.com/office/word/2015/wordml/symex" xmlns:w16du="http://schemas.microsoft.com/office/word/2023/wordml/word16du" xmlns:wne="http://schemas.microsoft.com/office/word/2006/wordml" mc:Ignorable="w14 w15 w16se w16cid w16 w16cex w16sdtdh w16sdtfl w16du wp14">
   <w:footnote w:type="separator" w:id="-1">
     <w:p>
       <w:pPr>
@@ -1041,7 +950,7 @@
 </file>
 
 <file path=word/header1.xml><?xml version="1.0" encoding="utf-8"?>
-<w:hdr xmlns:wpc="http://schemas.microsoft.com/office/word/2010/wordprocessingCanvas" xmlns:cx="http://schemas.microsoft.com/office/drawing/2014/chartex" xmlns:cx1="http://schemas.microsoft.com/office/drawing/2015/9/8/chartex" xmlns:cx2="http://schemas.microsoft.com/office/drawing/2015/10/21/chartex" xmlns:cx3="http://schemas.microsoft.com/office/drawing/2016/5/9/chartex" xmlns:cx4="http://schemas.microsoft.com/office/drawing/2016/5/10/chartex" xmlns:cx5="http://schemas.microsoft.com/office/drawing/2016/5/11/chartex" xmlns:cx6="http://schemas.microsoft.com/office/drawing/2016/5/12/chartex" xmlns:cx7="http://schemas.microsoft.com/office/drawing/2016/5/13/chartex" xmlns:cx8="http://schemas.microsoft.com/office/drawing/2016/5/14/chartex" xmlns:mc="http://schemas.openxmlformats.org/markup-compatibility/2006" xmlns:aink="http://schemas.microsoft.com/office/drawing/2016/ink" xmlns:am3d="http://schemas.microsoft.com/office/drawing/2017/model3d" xmlns:o="urn:schemas-microsoft-com:office:office" xmlns:oel="http://schemas.microsoft.com/office/2019/extlst" xmlns:r="http://schemas.openxmlformats.org/officeDocument/2006/relationships" xmlns:m="http://schemas.openxmlformats.org/officeDocument/2006/math" xmlns:v="urn:schemas-microsoft-com:vml" xmlns:wp14="http://schemas.microsoft.com/office/word/2010/wordprocessingDrawing" xmlns:wp="http://schemas.openxmlformats.org/drawingml/2006/wordprocessingDrawing" xmlns:w10="urn:schemas-microsoft-com:office:word" xmlns:w="http://schemas.openxmlformats.org/wordprocessingml/2006/main" xmlns:w14="http://schemas.microsoft.com/office/word/2010/wordml" xmlns:w15="http://schemas.microsoft.com/office/word/2012/wordml" xmlns:w16cex="http://schemas.microsoft.com/office/word/2018/wordml/cex" xmlns:w16cid="http://schemas.microsoft.com/office/word/2016/wordml/cid" xmlns:w16="http://schemas.microsoft.com/office/word/2018/wordml" xmlns:w16du="http://schemas.microsoft.com/office/word/2023/wordml/word16du" xmlns:w16sdtdh="http://schemas.microsoft.com/office/word/2020/wordml/sdtdatahash" xmlns:w16sdtfl="http://schemas.microsoft.com/office/word/2024/wordml/sdtformatlock" xmlns:w16se="http://schemas.microsoft.com/office/word/2015/wordml/symex" xmlns:wpg="http://schemas.microsoft.com/office/word/2010/wordprocessingGroup" xmlns:wpi="http://schemas.microsoft.com/office/word/2010/wordprocessingInk" xmlns:wne="http://schemas.microsoft.com/office/word/2006/wordml" xmlns:wps="http://schemas.microsoft.com/office/word/2010/wordprocessingShape" mc:Ignorable="w14 w15 w16se w16cid w16 w16cex w16sdtdh w16sdtfl w16du wp14">
+<w:hdr xmlns:wpc="http://schemas.microsoft.com/office/word/2010/wordprocessingCanvas" xmlns:cx="http://schemas.microsoft.com/office/drawing/2014/chartex" xmlns:cx1="http://schemas.microsoft.com/office/drawing/2015/9/8/chartex" xmlns:cx2="http://schemas.microsoft.com/office/drawing/2015/10/21/chartex" xmlns:cx3="http://schemas.microsoft.com/office/drawing/2016/5/9/chartex" xmlns:cx4="http://schemas.microsoft.com/office/drawing/2016/5/10/chartex" xmlns:cx5="http://schemas.microsoft.com/office/drawing/2016/5/11/chartex" xmlns:cx6="http://schemas.microsoft.com/office/drawing/2016/5/12/chartex" xmlns:cx7="http://schemas.microsoft.com/office/drawing/2016/5/13/chartex" xmlns:cx8="http://schemas.microsoft.com/office/drawing/2016/5/14/chartex" xmlns:mc="http://schemas.openxmlformats.org/markup-compatibility/2006" xmlns:m="http://schemas.openxmlformats.org/officeDocument/2006/math" xmlns:aink="http://schemas.microsoft.com/office/drawing/2016/ink" xmlns:am3d="http://schemas.microsoft.com/office/drawing/2017/model3d" xmlns:oel="http://schemas.microsoft.com/office/2019/extlst" xmlns:r="http://schemas.openxmlformats.org/officeDocument/2006/relationships" xmlns:wp14="http://schemas.microsoft.com/office/word/2010/wordprocessingDrawing" xmlns:wp="http://schemas.openxmlformats.org/drawingml/2006/wordprocessingDrawing" xmlns:wpg="http://schemas.microsoft.com/office/word/2010/wordprocessingGroup" xmlns:wpi="http://schemas.microsoft.com/office/word/2010/wordprocessingInk" xmlns:wps="http://schemas.microsoft.com/office/word/2010/wordprocessingShape" xmlns:o="urn:schemas-microsoft-com:office:office" xmlns:v="urn:schemas-microsoft-com:vml" xmlns:w10="urn:schemas-microsoft-com:office:word" xmlns:w="http://schemas.openxmlformats.org/wordprocessingml/2006/main" xmlns:w14="http://schemas.microsoft.com/office/word/2010/wordml" xmlns:w15="http://schemas.microsoft.com/office/word/2012/wordml" xmlns:w16cei="http://schemas.microsoft.com/office/word/2026/wordml/cei" xmlns:w16cex="http://schemas.microsoft.com/office/word/2018/wordml/cex" xmlns:w16cid="http://schemas.microsoft.com/office/word/2016/wordml/cid" xmlns:w16="http://schemas.microsoft.com/office/word/2018/wordml" xmlns:w16sdtdh="http://schemas.microsoft.com/office/word/2020/wordml/sdtdatahash" xmlns:w16sdtfl="http://schemas.microsoft.com/office/word/2024/wordml/sdtformatlock" xmlns:w16se="http://schemas.microsoft.com/office/word/2015/wordml/symex" xmlns:w16du="http://schemas.microsoft.com/office/word/2023/wordml/word16du" xmlns:wne="http://schemas.microsoft.com/office/word/2006/wordml" mc:Ignorable="w14 w15 w16se w16cid w16 w16cex w16sdtdh w16sdtfl w16du wp14">
   <w:p>
     <w:pPr>
       <w:pStyle w:val="En-tte"/>
@@ -1106,7 +1015,7 @@
 </file>
 
 <file path=word/header2.xml><?xml version="1.0" encoding="utf-8"?>
-<w:hdr xmlns:wpc="http://schemas.microsoft.com/office/word/2010/wordprocessingCanvas" xmlns:cx="http://schemas.microsoft.com/office/drawing/2014/chartex" xmlns:cx1="http://schemas.microsoft.com/office/drawing/2015/9/8/chartex" xmlns:cx2="http://schemas.microsoft.com/office/drawing/2015/10/21/chartex" xmlns:cx3="http://schemas.microsoft.com/office/drawing/2016/5/9/chartex" xmlns:cx4="http://schemas.microsoft.com/office/drawing/2016/5/10/chartex" xmlns:cx5="http://schemas.microsoft.com/office/drawing/2016/5/11/chartex" xmlns:cx6="http://schemas.microsoft.com/office/drawing/2016/5/12/chartex" xmlns:cx7="http://schemas.microsoft.com/office/drawing/2016/5/13/chartex" xmlns:cx8="http://schemas.microsoft.com/office/drawing/2016/5/14/chartex" xmlns:mc="http://schemas.openxmlformats.org/markup-compatibility/2006" xmlns:aink="http://schemas.microsoft.com/office/drawing/2016/ink" xmlns:am3d="http://schemas.microsoft.com/office/drawing/2017/model3d" xmlns:o="urn:schemas-microsoft-com:office:office" xmlns:oel="http://schemas.microsoft.com/office/2019/extlst" xmlns:r="http://schemas.openxmlformats.org/officeDocument/2006/relationships" xmlns:m="http://schemas.openxmlformats.org/officeDocument/2006/math" xmlns:v="urn:schemas-microsoft-com:vml" xmlns:wp14="http://schemas.microsoft.com/office/word/2010/wordprocessingDrawing" xmlns:wp="http://schemas.openxmlformats.org/drawingml/2006/wordprocessingDrawing" xmlns:w10="urn:schemas-microsoft-com:office:word" xmlns:w="http://schemas.openxmlformats.org/wordprocessingml/2006/main" xmlns:w14="http://schemas.microsoft.com/office/word/2010/wordml" xmlns:w15="http://schemas.microsoft.com/office/word/2012/wordml" xmlns:w16cex="http://schemas.microsoft.com/office/word/2018/wordml/cex" xmlns:w16cid="http://schemas.microsoft.com/office/word/2016/wordml/cid" xmlns:w16="http://schemas.microsoft.com/office/word/2018/wordml" xmlns:w16du="http://schemas.microsoft.com/office/word/2023/wordml/word16du" xmlns:w16sdtdh="http://schemas.microsoft.com/office/word/2020/wordml/sdtdatahash" xmlns:w16sdtfl="http://schemas.microsoft.com/office/word/2024/wordml/sdtformatlock" xmlns:w16se="http://schemas.microsoft.com/office/word/2015/wordml/symex" xmlns:wpg="http://schemas.microsoft.com/office/word/2010/wordprocessingGroup" xmlns:wpi="http://schemas.microsoft.com/office/word/2010/wordprocessingInk" xmlns:wne="http://schemas.microsoft.com/office/word/2006/wordml" xmlns:wps="http://schemas.microsoft.com/office/word/2010/wordprocessingShape" mc:Ignorable="w14 w15 w16se w16cid w16 w16cex w16sdtdh w16sdtfl w16du wp14">
+<w:hdr xmlns:wpc="http://schemas.microsoft.com/office/word/2010/wordprocessingCanvas" xmlns:cx="http://schemas.microsoft.com/office/drawing/2014/chartex" xmlns:cx1="http://schemas.microsoft.com/office/drawing/2015/9/8/chartex" xmlns:cx2="http://schemas.microsoft.com/office/drawing/2015/10/21/chartex" xmlns:cx3="http://schemas.microsoft.com/office/drawing/2016/5/9/chartex" xmlns:cx4="http://schemas.microsoft.com/office/drawing/2016/5/10/chartex" xmlns:cx5="http://schemas.microsoft.com/office/drawing/2016/5/11/chartex" xmlns:cx6="http://schemas.microsoft.com/office/drawing/2016/5/12/chartex" xmlns:cx7="http://schemas.microsoft.com/office/drawing/2016/5/13/chartex" xmlns:cx8="http://schemas.microsoft.com/office/drawing/2016/5/14/chartex" xmlns:mc="http://schemas.openxmlformats.org/markup-compatibility/2006" xmlns:m="http://schemas.openxmlformats.org/officeDocument/2006/math" xmlns:aink="http://schemas.microsoft.com/office/drawing/2016/ink" xmlns:am3d="http://schemas.microsoft.com/office/drawing/2017/model3d" xmlns:oel="http://schemas.microsoft.com/office/2019/extlst" xmlns:r="http://schemas.openxmlformats.org/officeDocument/2006/relationships" xmlns:wp14="http://schemas.microsoft.com/office/word/2010/wordprocessingDrawing" xmlns:wp="http://schemas.openxmlformats.org/drawingml/2006/wordprocessingDrawing" xmlns:wpg="http://schemas.microsoft.com/office/word/2010/wordprocessingGroup" xmlns:wpi="http://schemas.microsoft.com/office/word/2010/wordprocessingInk" xmlns:wps="http://schemas.microsoft.com/office/word/2010/wordprocessingShape" xmlns:o="urn:schemas-microsoft-com:office:office" xmlns:v="urn:schemas-microsoft-com:vml" xmlns:w10="urn:schemas-microsoft-com:office:word" xmlns:w="http://schemas.openxmlformats.org/wordprocessingml/2006/main" xmlns:w14="http://schemas.microsoft.com/office/word/2010/wordml" xmlns:w15="http://schemas.microsoft.com/office/word/2012/wordml" xmlns:w16cei="http://schemas.microsoft.com/office/word/2026/wordml/cei" xmlns:w16cex="http://schemas.microsoft.com/office/word/2018/wordml/cex" xmlns:w16cid="http://schemas.microsoft.com/office/word/2016/wordml/cid" xmlns:w16="http://schemas.microsoft.com/office/word/2018/wordml" xmlns:w16sdtdh="http://schemas.microsoft.com/office/word/2020/wordml/sdtdatahash" xmlns:w16sdtfl="http://schemas.microsoft.com/office/word/2024/wordml/sdtformatlock" xmlns:w16se="http://schemas.microsoft.com/office/word/2015/wordml/symex" xmlns:w16du="http://schemas.microsoft.com/office/word/2023/wordml/word16du" xmlns:wne="http://schemas.microsoft.com/office/word/2006/wordml" mc:Ignorable="w14 w15 w16se w16cid w16 w16cex w16sdtdh w16sdtfl w16du wp14">
   <w:p>
     <w:pPr>
       <w:pStyle w:val="En-tte"/>
@@ -1169,7 +1078,7 @@
 </file>
 
 <file path=word/numbering.xml><?xml version="1.0" encoding="utf-8"?>
-<w:numbering xmlns:wpc="http://schemas.microsoft.com/office/word/2010/wordprocessingCanvas" xmlns:cx="http://schemas.microsoft.com/office/drawing/2014/chartex" xmlns:cx1="http://schemas.microsoft.com/office/drawing/2015/9/8/chartex" xmlns:cx2="http://schemas.microsoft.com/office/drawing/2015/10/21/chartex" xmlns:cx3="http://schemas.microsoft.com/office/drawing/2016/5/9/chartex" xmlns:cx4="http://schemas.microsoft.com/office/drawing/2016/5/10/chartex" xmlns:cx5="http://schemas.microsoft.com/office/drawing/2016/5/11/chartex" xmlns:cx6="http://schemas.microsoft.com/office/drawing/2016/5/12/chartex" xmlns:cx7="http://schemas.microsoft.com/office/drawing/2016/5/13/chartex" xmlns:cx8="http://schemas.microsoft.com/office/drawing/2016/5/14/chartex" xmlns:mc="http://schemas.openxmlformats.org/markup-compatibility/2006" xmlns:aink="http://schemas.microsoft.com/office/drawing/2016/ink" xmlns:am3d="http://schemas.microsoft.com/office/drawing/2017/model3d" xmlns:o="urn:schemas-microsoft-com:office:office" xmlns:oel="http://schemas.microsoft.com/office/2019/extlst" xmlns:r="http://schemas.openxmlformats.org/officeDocument/2006/relationships" xmlns:m="http://schemas.openxmlformats.org/officeDocument/2006/math" xmlns:v="urn:schemas-microsoft-com:vml" xmlns:wp14="http://schemas.microsoft.com/office/word/2010/wordprocessingDrawing" xmlns:wp="http://schemas.openxmlformats.org/drawingml/2006/wordprocessingDrawing" xmlns:w10="urn:schemas-microsoft-com:office:word" xmlns:w="http://schemas.openxmlformats.org/wordprocessingml/2006/main" xmlns:w14="http://schemas.microsoft.com/office/word/2010/wordml" xmlns:w15="http://schemas.microsoft.com/office/word/2012/wordml" xmlns:w16cex="http://schemas.microsoft.com/office/word/2018/wordml/cex" xmlns:w16cid="http://schemas.microsoft.com/office/word/2016/wordml/cid" xmlns:w16="http://schemas.microsoft.com/office/word/2018/wordml" xmlns:w16du="http://schemas.microsoft.com/office/word/2023/wordml/word16du" xmlns:w16sdtdh="http://schemas.microsoft.com/office/word/2020/wordml/sdtdatahash" xmlns:w16sdtfl="http://schemas.microsoft.com/office/word/2024/wordml/sdtformatlock" xmlns:w16se="http://schemas.microsoft.com/office/word/2015/wordml/symex" xmlns:wpg="http://schemas.microsoft.com/office/word/2010/wordprocessingGroup" xmlns:wpi="http://schemas.microsoft.com/office/word/2010/wordprocessingInk" xmlns:wne="http://schemas.microsoft.com/office/word/2006/wordml" xmlns:wps="http://schemas.microsoft.com/office/word/2010/wordprocessingShape" mc:Ignorable="w14 w15 w16se w16cid w16 w16cex w16sdtdh w16sdtfl w16du wp14">
+<w:numbering xmlns:wpc="http://schemas.microsoft.com/office/word/2010/wordprocessingCanvas" xmlns:cx="http://schemas.microsoft.com/office/drawing/2014/chartex" xmlns:cx1="http://schemas.microsoft.com/office/drawing/2015/9/8/chartex" xmlns:cx2="http://schemas.microsoft.com/office/drawing/2015/10/21/chartex" xmlns:cx3="http://schemas.microsoft.com/office/drawing/2016/5/9/chartex" xmlns:cx4="http://schemas.microsoft.com/office/drawing/2016/5/10/chartex" xmlns:cx5="http://schemas.microsoft.com/office/drawing/2016/5/11/chartex" xmlns:cx6="http://schemas.microsoft.com/office/drawing/2016/5/12/chartex" xmlns:cx7="http://schemas.microsoft.com/office/drawing/2016/5/13/chartex" xmlns:cx8="http://schemas.microsoft.com/office/drawing/2016/5/14/chartex" xmlns:mc="http://schemas.openxmlformats.org/markup-compatibility/2006" xmlns:m="http://schemas.openxmlformats.org/officeDocument/2006/math" xmlns:aink="http://schemas.microsoft.com/office/drawing/2016/ink" xmlns:am3d="http://schemas.microsoft.com/office/drawing/2017/model3d" xmlns:oel="http://schemas.microsoft.com/office/2019/extlst" xmlns:r="http://schemas.openxmlformats.org/officeDocument/2006/relationships" xmlns:wp14="http://schemas.microsoft.com/office/word/2010/wordprocessingDrawing" xmlns:wp="http://schemas.openxmlformats.org/drawingml/2006/wordprocessingDrawing" xmlns:wpg="http://schemas.microsoft.com/office/word/2010/wordprocessingGroup" xmlns:wpi="http://schemas.microsoft.com/office/word/2010/wordprocessingInk" xmlns:wps="http://schemas.microsoft.com/office/word/2010/wordprocessingShape" xmlns:o="urn:schemas-microsoft-com:office:office" xmlns:v="urn:schemas-microsoft-com:vml" xmlns:w10="urn:schemas-microsoft-com:office:word" xmlns:w="http://schemas.openxmlformats.org/wordprocessingml/2006/main" xmlns:w14="http://schemas.microsoft.com/office/word/2010/wordml" xmlns:w15="http://schemas.microsoft.com/office/word/2012/wordml" xmlns:w16cei="http://schemas.microsoft.com/office/word/2026/wordml/cei" xmlns:w16cex="http://schemas.microsoft.com/office/word/2018/wordml/cex" xmlns:w16cid="http://schemas.microsoft.com/office/word/2016/wordml/cid" xmlns:w16="http://schemas.microsoft.com/office/word/2018/wordml" xmlns:w16sdtdh="http://schemas.microsoft.com/office/word/2020/wordml/sdtdatahash" xmlns:w16sdtfl="http://schemas.microsoft.com/office/word/2024/wordml/sdtformatlock" xmlns:w16se="http://schemas.microsoft.com/office/word/2015/wordml/symex" xmlns:w16du="http://schemas.microsoft.com/office/word/2023/wordml/word16du" xmlns:wne="http://schemas.microsoft.com/office/word/2006/wordml" mc:Ignorable="w14 w15 w16se w16cid w16 w16cex w16sdtdh w16sdtfl w16du wp14">
   <w:abstractNum w:abstractNumId="0" w15:restartNumberingAfterBreak="0">
     <w:nsid w:val="458418F3"/>
     <w:multiLevelType w:val="multilevel"/>
@@ -1320,7 +1229,7 @@
 </file>
 
 <file path=word/styles.xml><?xml version="1.0" encoding="utf-8"?>
-<w:styles xmlns:mc="http://schemas.openxmlformats.org/markup-compatibility/2006" xmlns:r="http://schemas.openxmlformats.org/officeDocument/2006/relationships" xmlns:w="http://schemas.openxmlformats.org/wordprocessingml/2006/main" xmlns:w14="http://schemas.microsoft.com/office/word/2010/wordml" xmlns:w15="http://schemas.microsoft.com/office/word/2012/wordml" xmlns:w16cex="http://schemas.microsoft.com/office/word/2018/wordml/cex" xmlns:w16cid="http://schemas.microsoft.com/office/word/2016/wordml/cid" xmlns:w16="http://schemas.microsoft.com/office/word/2018/wordml" xmlns:w16du="http://schemas.microsoft.com/office/word/2023/wordml/word16du" xmlns:w16sdtdh="http://schemas.microsoft.com/office/word/2020/wordml/sdtdatahash" xmlns:w16sdtfl="http://schemas.microsoft.com/office/word/2024/wordml/sdtformatlock" xmlns:w16se="http://schemas.microsoft.com/office/word/2015/wordml/symex" mc:Ignorable="w14 w15 w16se w16cid w16 w16cex w16sdtdh w16sdtfl w16du">
+<w:styles xmlns:mc="http://schemas.openxmlformats.org/markup-compatibility/2006" xmlns:r="http://schemas.openxmlformats.org/officeDocument/2006/relationships" xmlns:w="http://schemas.openxmlformats.org/wordprocessingml/2006/main" xmlns:w14="http://schemas.microsoft.com/office/word/2010/wordml" xmlns:w15="http://schemas.microsoft.com/office/word/2012/wordml" xmlns:w16cex="http://schemas.microsoft.com/office/word/2018/wordml/cex" xmlns:w16cid="http://schemas.microsoft.com/office/word/2016/wordml/cid" xmlns:w16="http://schemas.microsoft.com/office/word/2018/wordml" xmlns:w16sdtdh="http://schemas.microsoft.com/office/word/2020/wordml/sdtdatahash" xmlns:w16sdtfl="http://schemas.microsoft.com/office/word/2024/wordml/sdtformatlock" xmlns:w16se="http://schemas.microsoft.com/office/word/2015/wordml/symex" xmlns:w16du="http://schemas.microsoft.com/office/word/2023/wordml/word16du" mc:Ignorable="w14 w15 w16se w16cid w16 w16cex w16sdtdh w16sdtfl w16du">
   <w:docDefaults>
     <w:rPrDefault>
       <w:rPr>

</xml_diff>

<commit_message>
Mise à jour du mémoire
</commit_message>
<xml_diff>
--- a/couverture/couverture.docx
+++ b/couverture/couverture.docx
@@ -71,7 +71,7 @@
           <w:noProof/>
         </w:rPr>
         <w:drawing>
-          <wp:anchor distT="0" distB="0" distL="114300" distR="114300" simplePos="0" relativeHeight="251660288" behindDoc="0" locked="0" layoutInCell="0" allowOverlap="1" wp14:anchorId="35106FD4" wp14:editId="31EFBF78">
+          <wp:anchor distT="0" distB="0" distL="114300" distR="114300" simplePos="0" relativeHeight="251660288" behindDoc="0" locked="0" layoutInCell="0" allowOverlap="1" wp14:anchorId="35106FD4" wp14:editId="16AC7BA1">
             <wp:simplePos x="0" y="0"/>
             <wp:positionH relativeFrom="column">
               <wp:posOffset>1925486</wp:posOffset>
@@ -547,13 +547,20 @@
                 <w:szCs w:val="24"/>
               </w:rPr>
             </w:pPr>
+            <w:r>
+              <w:rPr>
+                <w:sz w:val="24"/>
+                <w:szCs w:val="24"/>
+              </w:rPr>
+              <w:t>Dr</w:t>
+            </w:r>
             <w:commentRangeStart w:id="3"/>
             <w:r>
               <w:rPr>
                 <w:sz w:val="24"/>
                 <w:szCs w:val="24"/>
               </w:rPr>
-              <w:t xml:space="preserve">Titre </w:t>
+              <w:t xml:space="preserve"> </w:t>
             </w:r>
             <w:commentRangeEnd w:id="3"/>
             <w:r>
@@ -564,13 +571,20 @@
               </w:rPr>
               <w:commentReference w:id="3"/>
             </w:r>
+            <w:r>
+              <w:rPr>
+                <w:sz w:val="24"/>
+                <w:szCs w:val="24"/>
+              </w:rPr>
+              <w:t>Eric</w:t>
+            </w:r>
             <w:commentRangeStart w:id="4"/>
             <w:r>
               <w:rPr>
                 <w:sz w:val="24"/>
                 <w:szCs w:val="24"/>
               </w:rPr>
-              <w:t>Prénom NOM</w:t>
+              <w:t xml:space="preserve"> </w:t>
             </w:r>
             <w:commentRangeEnd w:id="4"/>
             <w:r>
@@ -580,6 +594,13 @@
                 <w:szCs w:val="24"/>
               </w:rPr>
               <w:commentReference w:id="4"/>
+            </w:r>
+            <w:r>
+              <w:rPr>
+                <w:sz w:val="24"/>
+                <w:szCs w:val="24"/>
+              </w:rPr>
+              <w:t>Marcon</w:t>
             </w:r>
           </w:p>
         </w:tc>

</xml_diff>